<commit_message>
a7 relaxed and round 8 prep
</commit_message>
<xml_diff>
--- a/templates/GIZ-Template.docx
+++ b/templates/GIZ-Template.docx
@@ -1338,6 +1338,11 @@
         </w:rPr>
         <w:t xml:space="preserve">{% for kq in key_qualifications %} {{ kq }}</w:t>
       </w:r>
+      <w:r>
+        <w:rPr>
+          <w:rtl w:val="0"/>
+        </w:rPr>
+      </w:r>
     </w:p>
     <w:p>
       <w:pPr>
@@ -1365,6 +1370,11 @@
           <w:rtl w:val="0"/>
         </w:rPr>
         <w:t xml:space="preserve">{% endfor %}</w:t>
+      </w:r>
+      <w:r>
+        <w:rPr>
+          <w:rtl w:val="0"/>
+        </w:rPr>
       </w:r>
     </w:p>
     <w:p>
@@ -1560,7 +1570,8 @@
           <w:headerReference r:id="rId7" w:type="first"/>
           <w:headerReference r:id="rId8" w:type="even"/>
           <w:footerReference r:id="rId9" w:type="default"/>
-          <w:footerReference r:id="rId10" w:type="even"/>
+          <w:footerReference r:id="rId10" w:type="first"/>
+          <w:footerReference r:id="rId11" w:type="even"/>
           <w:pgSz w:h="16840" w:w="11907" w:orient="portrait"/>
           <w:pgMar w:bottom="567" w:top="1418" w:left="1588" w:right="1134" w:header="454" w:footer="454"/>
           <w:pgNumType w:start="1"/>
@@ -1609,9 +1620,9 @@
     <w:tbl>
       <w:tblPr>
         <w:tblStyle w:val="Table6"/>
-        <w:tblW w:w="15735.0" w:type="dxa"/>
+        <w:tblW w:w="9210.0" w:type="dxa"/>
         <w:jc w:val="left"/>
-        <w:tblInd w:w="-567.0" w:type="dxa"/>
+        <w:tblInd w:w="17.99999999999997" w:type="dxa"/>
         <w:tblBorders>
           <w:top w:color="000000" w:space="0" w:sz="4" w:val="single"/>
           <w:left w:color="000000" w:space="0" w:sz="4" w:val="single"/>
@@ -1624,20 +1635,20 @@
         <w:tblLook w:val="04A0"/>
       </w:tblPr>
       <w:tblGrid>
-        <w:gridCol w:w="851"/>
-        <w:gridCol w:w="825"/>
-        <w:gridCol w:w="1134"/>
-        <w:gridCol w:w="3058"/>
-        <w:gridCol w:w="2008"/>
-        <w:gridCol w:w="7859"/>
+        <w:gridCol w:w="795"/>
+        <w:gridCol w:w="795"/>
+        <w:gridCol w:w="1080"/>
+        <w:gridCol w:w="1590"/>
+        <w:gridCol w:w="1650"/>
+        <w:gridCol w:w="3300"/>
         <w:tblGridChange w:id="0">
           <w:tblGrid>
-            <w:gridCol w:w="851"/>
-            <w:gridCol w:w="825"/>
-            <w:gridCol w:w="1134"/>
-            <w:gridCol w:w="3058"/>
-            <w:gridCol w:w="2008"/>
-            <w:gridCol w:w="7859"/>
+            <w:gridCol w:w="795"/>
+            <w:gridCol w:w="795"/>
+            <w:gridCol w:w="1080"/>
+            <w:gridCol w:w="1590"/>
+            <w:gridCol w:w="1650"/>
+            <w:gridCol w:w="3300"/>
           </w:tblGrid>
         </w:tblGridChange>
       </w:tblGrid>
@@ -1648,7 +1659,7 @@
         </w:trPr>
         <w:tc>
           <w:tcPr/>
-          <w:bookmarkStart w:colFirst="0" w:colLast="0" w:name="mu97gheuhnpk" w:id="0"/>
+          <w:bookmarkStart w:colFirst="0" w:colLast="0" w:name="nwszm3stry1q" w:id="0"/>
           <w:bookmarkEnd w:id="0"/>
           <w:p>
             <w:pPr>
@@ -2083,12 +2094,12 @@
       </w:r>
     </w:p>
     <w:sectPr>
-      <w:headerReference r:id="rId11" w:type="default"/>
-      <w:headerReference r:id="rId12" w:type="even"/>
-      <w:footerReference r:id="rId13" w:type="default"/>
-      <w:footerReference r:id="rId14" w:type="even"/>
+      <w:headerReference r:id="rId12" w:type="default"/>
+      <w:headerReference r:id="rId13" w:type="even"/>
+      <w:footerReference r:id="rId14" w:type="default"/>
+      <w:footerReference r:id="rId15" w:type="even"/>
       <w:type w:val="nextPage"/>
-      <w:pgSz w:h="11907" w:w="16840" w:orient="landscape"/>
+      <w:pgSz w:h="16840" w:w="11907" w:orient="portrait"/>
       <w:pgMar w:bottom="567" w:top="1304" w:left="1134" w:right="1134" w:header="851" w:footer="454"/>
     </w:sectPr>
   </w:body>
@@ -2109,6 +2120,7 @@
       <w:tabs>
         <w:tab w:val="left" w:leader="none" w:pos="-170"/>
       </w:tabs>
+      <w:spacing w:before="240" w:lineRule="auto"/>
       <w:jc w:val="center"/>
       <w:rPr>
         <w:b w:val="1"/>
@@ -2175,7 +2187,6 @@
       <w:tabs>
         <w:tab w:val="left" w:leader="none" w:pos="-170"/>
       </w:tabs>
-      <w:spacing w:before="240" w:lineRule="auto"/>
       <w:jc w:val="center"/>
       <w:rPr>
         <w:b w:val="1"/>
@@ -2242,12 +2253,13 @@
       <w:tabs>
         <w:tab w:val="left" w:leader="none" w:pos="-170"/>
       </w:tabs>
-      <w:jc w:val="right"/>
+      <w:spacing w:before="240" w:lineRule="auto"/>
+      <w:jc w:val="center"/>
       <w:rPr>
         <w:b w:val="1"/>
         <w:bCs w:val="1"/>
         <w:smallCaps w:val="1"/>
-        <w:color w:val="f39200"/>
+        <w:color w:val="000000"/>
         <w:sz w:val="17"/>
         <w:szCs w:val="17"/>
       </w:rPr>
@@ -2257,7 +2269,19 @@
         <w:b w:val="1"/>
         <w:bCs w:val="1"/>
         <w:smallCaps w:val="1"/>
-        <w:color w:val="f39200"/>
+        <w:color w:val="000000"/>
+        <w:sz w:val="17"/>
+        <w:szCs w:val="17"/>
+        <w:rtl w:val="0"/>
+      </w:rPr>
+      <w:t xml:space="preserve">- </w:t>
+    </w:r>
+    <w:r>
+      <w:rPr>
+        <w:b w:val="1"/>
+        <w:bCs w:val="1"/>
+        <w:smallCaps w:val="1"/>
+        <w:color w:val="000000"/>
         <w:sz w:val="17"/>
         <w:szCs w:val="17"/>
       </w:rPr>
@@ -2268,8 +2292,15 @@
     </w:r>
     <w:r>
       <w:rPr>
+        <w:b w:val="1"/>
+        <w:bCs w:val="1"/>
+        <w:smallCaps w:val="1"/>
+        <w:color w:val="000000"/>
+        <w:sz w:val="17"/>
+        <w:szCs w:val="17"/>
         <w:rtl w:val="0"/>
       </w:rPr>
+      <w:t xml:space="preserve"> -</w:t>
     </w:r>
   </w:p>
 </w:ftr>
@@ -2289,13 +2320,12 @@
       <w:tabs>
         <w:tab w:val="left" w:leader="none" w:pos="-170"/>
       </w:tabs>
-      <w:spacing w:before="240" w:lineRule="auto"/>
-      <w:jc w:val="center"/>
+      <w:jc w:val="right"/>
       <w:rPr>
         <w:b w:val="1"/>
         <w:bCs w:val="1"/>
         <w:smallCaps w:val="1"/>
-        <w:color w:val="000000"/>
+        <w:color w:val="f39200"/>
         <w:sz w:val="17"/>
         <w:szCs w:val="17"/>
       </w:rPr>
@@ -2305,19 +2335,7 @@
         <w:b w:val="1"/>
         <w:bCs w:val="1"/>
         <w:smallCaps w:val="1"/>
-        <w:color w:val="000000"/>
-        <w:sz w:val="17"/>
-        <w:szCs w:val="17"/>
-        <w:rtl w:val="0"/>
-      </w:rPr>
-      <w:t xml:space="preserve">- </w:t>
-    </w:r>
-    <w:r>
-      <w:rPr>
-        <w:b w:val="1"/>
-        <w:bCs w:val="1"/>
-        <w:smallCaps w:val="1"/>
-        <w:color w:val="000000"/>
+        <w:color w:val="f39200"/>
         <w:sz w:val="17"/>
         <w:szCs w:val="17"/>
       </w:rPr>
@@ -2328,15 +2346,23 @@
     </w:r>
     <w:r>
       <w:rPr>
-        <w:b w:val="1"/>
-        <w:bCs w:val="1"/>
-        <w:smallCaps w:val="1"/>
-        <w:color w:val="000000"/>
-        <w:sz w:val="17"/>
-        <w:szCs w:val="17"/>
         <w:rtl w:val="0"/>
       </w:rPr>
-      <w:t xml:space="preserve"> -</w:t>
+    </w:r>
+  </w:p>
+</w:ftr>
+</file>
+
+<file path=word/footer5.xml><?xml version="1.0" encoding="utf-8"?>
+<w:ftr xmlns:mc="http://schemas.openxmlformats.org/markup-compatibility/2006" xmlns:o="urn:schemas-microsoft-com:office:office" xmlns:r="http://schemas.openxmlformats.org/officeDocument/2006/relationships" xmlns:m="http://schemas.openxmlformats.org/officeDocument/2006/math" xmlns:v="urn:schemas-microsoft-com:vml" xmlns:wp="http://schemas.openxmlformats.org/drawingml/2006/wordprocessingDrawing" xmlns:w10="urn:schemas-microsoft-com:office:word" xmlns:w="http://schemas.openxmlformats.org/wordprocessingml/2006/main" xmlns:wne="http://schemas.microsoft.com/office/word/2006/wordml" xmlns:sl="http://schemas.openxmlformats.org/schemaLibrary/2006/main" xmlns:a="http://schemas.openxmlformats.org/drawingml/2006/main" xmlns:pic="http://schemas.openxmlformats.org/drawingml/2006/picture" xmlns:c="http://schemas.openxmlformats.org/drawingml/2006/chart" xmlns:lc="http://schemas.openxmlformats.org/drawingml/2006/lockedCanvas" xmlns:dgm="http://schemas.openxmlformats.org/drawingml/2006/diagram" xmlns:wps="http://schemas.microsoft.com/office/word/2010/wordprocessingShape" xmlns:wpg="http://schemas.microsoft.com/office/word/2010/wordprocessingGroup" xmlns:w14="http://schemas.microsoft.com/office/word/2010/wordml" xmlns:w15="http://schemas.microsoft.com/office/word/2012/wordml" xmlns:w16="http://schemas.microsoft.com/office/word/2018/wordml" xmlns:w16cex="http://schemas.microsoft.com/office/word/2018/wordml/cex" xmlns:w16cid="http://schemas.microsoft.com/office/word/2016/wordml/cid" xmlns="http://schemas.microsoft.com/office/tasks/2019/documenttasks" xmlns:cr="http://schemas.microsoft.com/office/comments/2020/reactions">
+  <w:p>
+    <w:pPr>
+      <w:rPr/>
+    </w:pPr>
+    <w:r>
+      <w:rPr>
+        <w:rtl w:val="0"/>
+      </w:rPr>
     </w:r>
   </w:p>
 </w:ftr>
@@ -2355,7 +2381,12 @@
         <w:between w:space="0" w:sz="0" w:val="nil"/>
       </w:pBdr>
       <w:rPr>
-        <w:color w:val="000000"/>
+        <w:b w:val="1"/>
+        <w:bCs w:val="1"/>
+        <w:smallCaps w:val="1"/>
+        <w:color w:val="ffffff"/>
+        <w:sz w:val="16"/>
+        <w:szCs w:val="16"/>
       </w:rPr>
     </w:pPr>
     <w:r>
@@ -2367,6 +2398,155 @@
   <w:tbl>
     <w:tblPr>
       <w:tblStyle w:val="Table7"/>
+      <w:tblW w:w="9180.0" w:type="dxa"/>
+      <w:jc w:val="left"/>
+      <w:tblBorders>
+        <w:bottom w:color="1f497d" w:space="0" w:sz="4" w:val="single"/>
+      </w:tblBorders>
+      <w:tblLayout w:type="fixed"/>
+      <w:tblLook w:val="0400"/>
+    </w:tblPr>
+    <w:tblGrid>
+      <w:gridCol w:w="7836"/>
+      <w:gridCol w:w="1344"/>
+      <w:tblGridChange w:id="0">
+        <w:tblGrid>
+          <w:gridCol w:w="7836"/>
+          <w:gridCol w:w="1344"/>
+        </w:tblGrid>
+      </w:tblGridChange>
+    </w:tblGrid>
+    <w:tr>
+      <w:trPr>
+        <w:cantSplit w:val="0"/>
+        <w:trHeight w:val="850" w:hRule="atLeast"/>
+        <w:tblHeader w:val="0"/>
+      </w:trPr>
+      <w:tc>
+        <w:tcPr>
+          <w:vAlign w:val="bottom"/>
+        </w:tcPr>
+        <w:p>
+          <w:pPr>
+            <w:pBdr>
+              <w:top w:space="0" w:sz="0" w:val="nil"/>
+              <w:left w:space="0" w:sz="0" w:val="nil"/>
+              <w:bottom w:space="0" w:sz="0" w:val="nil"/>
+              <w:right w:space="0" w:sz="0" w:val="nil"/>
+              <w:between w:space="0" w:sz="0" w:val="nil"/>
+            </w:pBdr>
+            <w:spacing w:after="200" w:lineRule="auto"/>
+            <w:rPr>
+              <w:b w:val="1"/>
+              <w:bCs w:val="1"/>
+              <w:smallCaps w:val="1"/>
+              <w:color w:val="1f497d"/>
+            </w:rPr>
+          </w:pPr>
+          <w:r>
+            <w:rPr>
+              <w:b w:val="1"/>
+              <w:bCs w:val="1"/>
+              <w:smallCaps w:val="1"/>
+              <w:color w:val="1f497d"/>
+              <w:rtl w:val="0"/>
+            </w:rPr>
+            <w:t xml:space="preserve">Curriculum VitaE  {{personal_info.title}}{{ personal_info.first_names }}{{ personal_info.family_name }}</w:t>
+          </w:r>
+        </w:p>
+      </w:tc>
+      <w:tc>
+        <w:tcPr>
+          <w:tcBorders>
+            <w:bottom w:color="1f497d" w:space="0" w:sz="4" w:val="single"/>
+            <w:right w:color="1f497d" w:space="0" w:sz="4" w:val="single"/>
+          </w:tcBorders>
+          <w:vAlign w:val="center"/>
+        </w:tcPr>
+        <w:p>
+          <w:pPr>
+            <w:pBdr>
+              <w:top w:space="0" w:sz="0" w:val="nil"/>
+              <w:left w:space="0" w:sz="0" w:val="nil"/>
+              <w:bottom w:space="0" w:sz="0" w:val="nil"/>
+              <w:right w:space="0" w:sz="0" w:val="nil"/>
+              <w:between w:space="0" w:sz="0" w:val="nil"/>
+            </w:pBdr>
+            <w:jc w:val="right"/>
+            <w:rPr>
+              <w:b w:val="1"/>
+              <w:bCs w:val="1"/>
+              <w:smallCaps w:val="1"/>
+              <w:color w:val="000000"/>
+              <w:sz w:val="16"/>
+              <w:szCs w:val="16"/>
+            </w:rPr>
+          </w:pPr>
+          <w:r>
+            <w:rPr>
+              <w:rtl w:val="0"/>
+            </w:rPr>
+          </w:r>
+        </w:p>
+      </w:tc>
+    </w:tr>
+  </w:tbl>
+  <w:p>
+    <w:pPr>
+      <w:rPr/>
+    </w:pPr>
+    <w:r>
+      <w:rPr>
+        <w:rtl w:val="0"/>
+      </w:rPr>
+    </w:r>
+  </w:p>
+</w:hdr>
+</file>
+
+<file path=word/header2.xml><?xml version="1.0" encoding="utf-8"?>
+<w:hdr xmlns:mc="http://schemas.openxmlformats.org/markup-compatibility/2006" xmlns:o="urn:schemas-microsoft-com:office:office" xmlns:r="http://schemas.openxmlformats.org/officeDocument/2006/relationships" xmlns:m="http://schemas.openxmlformats.org/officeDocument/2006/math" xmlns:v="urn:schemas-microsoft-com:vml" xmlns:wp="http://schemas.openxmlformats.org/drawingml/2006/wordprocessingDrawing" xmlns:w10="urn:schemas-microsoft-com:office:word" xmlns:w="http://schemas.openxmlformats.org/wordprocessingml/2006/main" xmlns:wne="http://schemas.microsoft.com/office/word/2006/wordml" xmlns:sl="http://schemas.openxmlformats.org/schemaLibrary/2006/main" xmlns:a="http://schemas.openxmlformats.org/drawingml/2006/main" xmlns:pic="http://schemas.openxmlformats.org/drawingml/2006/picture" xmlns:c="http://schemas.openxmlformats.org/drawingml/2006/chart" xmlns:lc="http://schemas.openxmlformats.org/drawingml/2006/lockedCanvas" xmlns:dgm="http://schemas.openxmlformats.org/drawingml/2006/diagram" xmlns:wps="http://schemas.microsoft.com/office/word/2010/wordprocessingShape" xmlns:wpg="http://schemas.microsoft.com/office/word/2010/wordprocessingGroup" xmlns:w14="http://schemas.microsoft.com/office/word/2010/wordml" xmlns:w15="http://schemas.microsoft.com/office/word/2012/wordml" xmlns:w16="http://schemas.microsoft.com/office/word/2018/wordml" xmlns:w16cex="http://schemas.microsoft.com/office/word/2018/wordml/cex" xmlns:w16cid="http://schemas.microsoft.com/office/word/2016/wordml/cid" xmlns="http://schemas.microsoft.com/office/tasks/2019/documenttasks" xmlns:cr="http://schemas.microsoft.com/office/comments/2020/reactions">
+  <w:p>
+    <w:pPr>
+      <w:tabs>
+        <w:tab w:val="right" w:leader="none" w:pos="7372"/>
+      </w:tabs>
+      <w:rPr/>
+    </w:pPr>
+    <w:r>
+      <w:rPr>
+        <w:rtl w:val="0"/>
+      </w:rPr>
+    </w:r>
+  </w:p>
+</w:hdr>
+</file>
+
+<file path=word/header3.xml><?xml version="1.0" encoding="utf-8"?>
+<w:hdr xmlns:mc="http://schemas.openxmlformats.org/markup-compatibility/2006" xmlns:o="urn:schemas-microsoft-com:office:office" xmlns:r="http://schemas.openxmlformats.org/officeDocument/2006/relationships" xmlns:m="http://schemas.openxmlformats.org/officeDocument/2006/math" xmlns:v="urn:schemas-microsoft-com:vml" xmlns:wp="http://schemas.openxmlformats.org/drawingml/2006/wordprocessingDrawing" xmlns:w10="urn:schemas-microsoft-com:office:word" xmlns:w="http://schemas.openxmlformats.org/wordprocessingml/2006/main" xmlns:wne="http://schemas.microsoft.com/office/word/2006/wordml" xmlns:sl="http://schemas.openxmlformats.org/schemaLibrary/2006/main" xmlns:a="http://schemas.openxmlformats.org/drawingml/2006/main" xmlns:pic="http://schemas.openxmlformats.org/drawingml/2006/picture" xmlns:c="http://schemas.openxmlformats.org/drawingml/2006/chart" xmlns:lc="http://schemas.openxmlformats.org/drawingml/2006/lockedCanvas" xmlns:dgm="http://schemas.openxmlformats.org/drawingml/2006/diagram" xmlns:wps="http://schemas.microsoft.com/office/word/2010/wordprocessingShape" xmlns:wpg="http://schemas.microsoft.com/office/word/2010/wordprocessingGroup" xmlns:w14="http://schemas.microsoft.com/office/word/2010/wordml" xmlns:w15="http://schemas.microsoft.com/office/word/2012/wordml" xmlns:w16="http://schemas.microsoft.com/office/word/2018/wordml" xmlns:w16cex="http://schemas.microsoft.com/office/word/2018/wordml/cex" xmlns:w16cid="http://schemas.microsoft.com/office/word/2016/wordml/cid" xmlns="http://schemas.microsoft.com/office/tasks/2019/documenttasks" xmlns:cr="http://schemas.microsoft.com/office/comments/2020/reactions">
+  <w:p>
+    <w:pPr>
+      <w:widowControl w:val="0"/>
+      <w:pBdr>
+        <w:top w:space="0" w:sz="0" w:val="nil"/>
+        <w:left w:space="0" w:sz="0" w:val="nil"/>
+        <w:bottom w:space="0" w:sz="0" w:val="nil"/>
+        <w:right w:space="0" w:sz="0" w:val="nil"/>
+        <w:between w:space="0" w:sz="0" w:val="nil"/>
+      </w:pBdr>
+      <w:rPr>
+        <w:color w:val="000000"/>
+      </w:rPr>
+    </w:pPr>
+    <w:r>
+      <w:rPr>
+        <w:rtl w:val="0"/>
+      </w:rPr>
+    </w:r>
+  </w:p>
+  <w:tbl>
+    <w:tblPr>
+      <w:tblStyle w:val="Table8"/>
       <w:tblW w:w="9185.0" w:type="dxa"/>
       <w:jc w:val="left"/>
       <w:tblBorders>
@@ -2460,12 +2640,12 @@
               <wp:inline distB="0" distT="0" distL="0" distR="0">
                 <wp:extent cx="725725" cy="292985"/>
                 <wp:effectExtent b="0" l="0" r="0" t="0"/>
-                <wp:docPr id="3" name="image2.png"/>
+                <wp:docPr id="1" name="image1.png"/>
                 <a:graphic>
                   <a:graphicData uri="http://schemas.openxmlformats.org/drawingml/2006/picture">
                     <pic:pic>
                       <pic:nvPicPr>
-                        <pic:cNvPr id="0" name="image2.png"/>
+                        <pic:cNvPr id="0" name="image1.png"/>
                         <pic:cNvPicPr preferRelativeResize="0"/>
                       </pic:nvPicPr>
                       <pic:blipFill>
@@ -2525,18 +2705,11 @@
 </w:hdr>
 </file>
 
-<file path=word/header2.xml><?xml version="1.0" encoding="utf-8"?>
+<file path=word/header4.xml><?xml version="1.0" encoding="utf-8"?>
 <w:hdr xmlns:mc="http://schemas.openxmlformats.org/markup-compatibility/2006" xmlns:o="urn:schemas-microsoft-com:office:office" xmlns:r="http://schemas.openxmlformats.org/officeDocument/2006/relationships" xmlns:m="http://schemas.openxmlformats.org/officeDocument/2006/math" xmlns:v="urn:schemas-microsoft-com:vml" xmlns:wp="http://schemas.openxmlformats.org/drawingml/2006/wordprocessingDrawing" xmlns:w10="urn:schemas-microsoft-com:office:word" xmlns:w="http://schemas.openxmlformats.org/wordprocessingml/2006/main" xmlns:wne="http://schemas.microsoft.com/office/word/2006/wordml" xmlns:sl="http://schemas.openxmlformats.org/schemaLibrary/2006/main" xmlns:a="http://schemas.openxmlformats.org/drawingml/2006/main" xmlns:pic="http://schemas.openxmlformats.org/drawingml/2006/picture" xmlns:c="http://schemas.openxmlformats.org/drawingml/2006/chart" xmlns:lc="http://schemas.openxmlformats.org/drawingml/2006/lockedCanvas" xmlns:dgm="http://schemas.openxmlformats.org/drawingml/2006/diagram" xmlns:wps="http://schemas.microsoft.com/office/word/2010/wordprocessingShape" xmlns:wpg="http://schemas.microsoft.com/office/word/2010/wordprocessingGroup" xmlns:w14="http://schemas.microsoft.com/office/word/2010/wordml" xmlns:w15="http://schemas.microsoft.com/office/word/2012/wordml" xmlns:w16="http://schemas.microsoft.com/office/word/2018/wordml" xmlns:w16cex="http://schemas.microsoft.com/office/word/2018/wordml/cex" xmlns:w16cid="http://schemas.microsoft.com/office/word/2016/wordml/cid" xmlns="http://schemas.microsoft.com/office/tasks/2019/documenttasks" xmlns:cr="http://schemas.microsoft.com/office/comments/2020/reactions">
   <w:p>
     <w:pPr>
       <w:widowControl w:val="0"/>
-      <w:pBdr>
-        <w:top w:space="0" w:sz="0" w:val="nil"/>
-        <w:left w:space="0" w:sz="0" w:val="nil"/>
-        <w:bottom w:space="0" w:sz="0" w:val="nil"/>
-        <w:right w:space="0" w:sz="0" w:val="nil"/>
-        <w:between w:space="0" w:sz="0" w:val="nil"/>
-      </w:pBdr>
       <w:rPr>
         <w:b w:val="1"/>
         <w:bCs w:val="1"/>
@@ -2554,7 +2727,7 @@
   </w:p>
   <w:tbl>
     <w:tblPr>
-      <w:tblStyle w:val="Table8"/>
+      <w:tblStyle w:val="Table9"/>
       <w:tblW w:w="9180.0" w:type="dxa"/>
       <w:jc w:val="left"/>
       <w:tblBorders>
@@ -2585,13 +2758,6 @@
         </w:tcPr>
         <w:p>
           <w:pPr>
-            <w:pBdr>
-              <w:top w:space="0" w:sz="0" w:val="nil"/>
-              <w:left w:space="0" w:sz="0" w:val="nil"/>
-              <w:bottom w:space="0" w:sz="0" w:val="nil"/>
-              <w:right w:space="0" w:sz="0" w:val="nil"/>
-              <w:between w:space="0" w:sz="0" w:val="nil"/>
-            </w:pBdr>
             <w:spacing w:after="200" w:lineRule="auto"/>
             <w:rPr>
               <w:b w:val="1"/>
@@ -2622,19 +2788,11 @@
         </w:tcPr>
         <w:p>
           <w:pPr>
-            <w:pBdr>
-              <w:top w:space="0" w:sz="0" w:val="nil"/>
-              <w:left w:space="0" w:sz="0" w:val="nil"/>
-              <w:bottom w:space="0" w:sz="0" w:val="nil"/>
-              <w:right w:space="0" w:sz="0" w:val="nil"/>
-              <w:between w:space="0" w:sz="0" w:val="nil"/>
-            </w:pBdr>
             <w:jc w:val="right"/>
             <w:rPr>
               <w:b w:val="1"/>
               <w:bCs w:val="1"/>
               <w:smallCaps w:val="1"/>
-              <w:color w:val="000000"/>
               <w:sz w:val="16"/>
               <w:szCs w:val="16"/>
             </w:rPr>
@@ -2643,48 +2801,6 @@
             <w:rPr>
               <w:rtl w:val="0"/>
             </w:rPr>
-          </w:r>
-          <w:r>
-            <w:drawing>
-              <wp:anchor allowOverlap="1" behindDoc="0" distB="0" distT="0" distL="114300" distR="114300" hidden="0" layoutInCell="1" locked="0" relativeHeight="0" simplePos="0">
-                <wp:simplePos x="0" y="0"/>
-                <wp:positionH relativeFrom="column">
-                  <wp:posOffset>57787</wp:posOffset>
-                </wp:positionH>
-                <wp:positionV relativeFrom="paragraph">
-                  <wp:posOffset>-8888</wp:posOffset>
-                </wp:positionV>
-                <wp:extent cx="701040" cy="282575"/>
-                <wp:effectExtent b="0" l="0" r="0" t="0"/>
-                <wp:wrapNone/>
-                <wp:docPr id="2" name="image1.png"/>
-                <a:graphic>
-                  <a:graphicData uri="http://schemas.openxmlformats.org/drawingml/2006/picture">
-                    <pic:pic>
-                      <pic:nvPicPr>
-                        <pic:cNvPr id="0" name="image1.png"/>
-                        <pic:cNvPicPr preferRelativeResize="0"/>
-                      </pic:nvPicPr>
-                      <pic:blipFill>
-                        <a:blip r:embed="rId1"/>
-                        <a:srcRect b="-206" l="0" r="0" t="0"/>
-                        <a:stretch>
-                          <a:fillRect/>
-                        </a:stretch>
-                      </pic:blipFill>
-                      <pic:spPr>
-                        <a:xfrm>
-                          <a:off x="0" y="0"/>
-                          <a:ext cx="701040" cy="282575"/>
-                        </a:xfrm>
-                        <a:prstGeom prst="rect"/>
-                        <a:ln/>
-                      </pic:spPr>
-                    </pic:pic>
-                  </a:graphicData>
-                </a:graphic>
-              </wp:anchor>
-            </w:drawing>
           </w:r>
         </w:p>
       </w:tc>
@@ -2703,25 +2819,7 @@
 </w:hdr>
 </file>
 
-<file path=word/header3.xml><?xml version="1.0" encoding="utf-8"?>
-<w:hdr xmlns:mc="http://schemas.openxmlformats.org/markup-compatibility/2006" xmlns:o="urn:schemas-microsoft-com:office:office" xmlns:r="http://schemas.openxmlformats.org/officeDocument/2006/relationships" xmlns:m="http://schemas.openxmlformats.org/officeDocument/2006/math" xmlns:v="urn:schemas-microsoft-com:vml" xmlns:wp="http://schemas.openxmlformats.org/drawingml/2006/wordprocessingDrawing" xmlns:w10="urn:schemas-microsoft-com:office:word" xmlns:w="http://schemas.openxmlformats.org/wordprocessingml/2006/main" xmlns:wne="http://schemas.microsoft.com/office/word/2006/wordml" xmlns:sl="http://schemas.openxmlformats.org/schemaLibrary/2006/main" xmlns:a="http://schemas.openxmlformats.org/drawingml/2006/main" xmlns:pic="http://schemas.openxmlformats.org/drawingml/2006/picture" xmlns:c="http://schemas.openxmlformats.org/drawingml/2006/chart" xmlns:lc="http://schemas.openxmlformats.org/drawingml/2006/lockedCanvas" xmlns:dgm="http://schemas.openxmlformats.org/drawingml/2006/diagram" xmlns:wps="http://schemas.microsoft.com/office/word/2010/wordprocessingShape" xmlns:wpg="http://schemas.microsoft.com/office/word/2010/wordprocessingGroup" xmlns:w14="http://schemas.microsoft.com/office/word/2010/wordml" xmlns:w15="http://schemas.microsoft.com/office/word/2012/wordml" xmlns:w16="http://schemas.microsoft.com/office/word/2018/wordml" xmlns:w16cex="http://schemas.microsoft.com/office/word/2018/wordml/cex" xmlns:w16cid="http://schemas.microsoft.com/office/word/2016/wordml/cid" xmlns="http://schemas.microsoft.com/office/tasks/2019/documenttasks" xmlns:cr="http://schemas.microsoft.com/office/comments/2020/reactions">
-  <w:p>
-    <w:pPr>
-      <w:tabs>
-        <w:tab w:val="right" w:leader="none" w:pos="7372"/>
-      </w:tabs>
-      <w:rPr/>
-    </w:pPr>
-    <w:r>
-      <w:rPr>
-        <w:rtl w:val="0"/>
-      </w:rPr>
-    </w:r>
-  </w:p>
-</w:hdr>
-</file>
-
-<file path=word/header4.xml><?xml version="1.0" encoding="utf-8"?>
+<file path=word/header5.xml><?xml version="1.0" encoding="utf-8"?>
 <w:hdr xmlns:mc="http://schemas.openxmlformats.org/markup-compatibility/2006" xmlns:o="urn:schemas-microsoft-com:office:office" xmlns:r="http://schemas.openxmlformats.org/officeDocument/2006/relationships" xmlns:m="http://schemas.openxmlformats.org/officeDocument/2006/math" xmlns:v="urn:schemas-microsoft-com:vml" xmlns:wp="http://schemas.openxmlformats.org/drawingml/2006/wordprocessingDrawing" xmlns:w10="urn:schemas-microsoft-com:office:word" xmlns:w="http://schemas.openxmlformats.org/wordprocessingml/2006/main" xmlns:wne="http://schemas.microsoft.com/office/word/2006/wordml" xmlns:sl="http://schemas.openxmlformats.org/schemaLibrary/2006/main" xmlns:a="http://schemas.openxmlformats.org/drawingml/2006/main" xmlns:pic="http://schemas.openxmlformats.org/drawingml/2006/picture" xmlns:c="http://schemas.openxmlformats.org/drawingml/2006/chart" xmlns:lc="http://schemas.openxmlformats.org/drawingml/2006/lockedCanvas" xmlns:dgm="http://schemas.openxmlformats.org/drawingml/2006/diagram" xmlns:wps="http://schemas.microsoft.com/office/word/2010/wordprocessingShape" xmlns:wpg="http://schemas.microsoft.com/office/word/2010/wordprocessingGroup" xmlns:w14="http://schemas.microsoft.com/office/word/2010/wordml" xmlns:w15="http://schemas.microsoft.com/office/word/2012/wordml" xmlns:w16="http://schemas.microsoft.com/office/word/2018/wordml" xmlns:w16cex="http://schemas.microsoft.com/office/word/2018/wordml/cex" xmlns:w16cid="http://schemas.microsoft.com/office/word/2016/wordml/cid" xmlns="http://schemas.microsoft.com/office/tasks/2019/documenttasks" xmlns:cr="http://schemas.microsoft.com/office/comments/2020/reactions">
   <w:p>
     <w:pPr>
@@ -2743,7 +2841,7 @@
   </w:p>
   <w:tbl>
     <w:tblPr>
-      <w:tblStyle w:val="Table9"/>
+      <w:tblStyle w:val="Table10"/>
       <w:tblW w:w="9185.0" w:type="dxa"/>
       <w:jc w:val="center"/>
       <w:tblBorders>
@@ -2837,12 +2935,12 @@
               <wp:inline distB="0" distT="0" distL="0" distR="0">
                 <wp:extent cx="725725" cy="292985"/>
                 <wp:effectExtent b="0" l="0" r="0" t="0"/>
-                <wp:docPr id="4" name="image2.png"/>
+                <wp:docPr id="2" name="image1.png"/>
                 <a:graphic>
                   <a:graphicData uri="http://schemas.openxmlformats.org/drawingml/2006/picture">
                     <pic:pic>
                       <pic:nvPicPr>
-                        <pic:cNvPr id="0" name="image2.png"/>
+                        <pic:cNvPr id="0" name="image1.png"/>
                         <pic:cNvPicPr preferRelativeResize="0"/>
                       </pic:nvPicPr>
                       <pic:blipFill>
@@ -2892,184 +2990,6 @@
         <w:sz w:val="16"/>
         <w:szCs w:val="16"/>
       </w:rPr>
-    </w:pPr>
-    <w:r>
-      <w:rPr>
-        <w:rtl w:val="0"/>
-      </w:rPr>
-    </w:r>
-  </w:p>
-</w:hdr>
-</file>
-
-<file path=word/header5.xml><?xml version="1.0" encoding="utf-8"?>
-<w:hdr xmlns:mc="http://schemas.openxmlformats.org/markup-compatibility/2006" xmlns:o="urn:schemas-microsoft-com:office:office" xmlns:r="http://schemas.openxmlformats.org/officeDocument/2006/relationships" xmlns:m="http://schemas.openxmlformats.org/officeDocument/2006/math" xmlns:v="urn:schemas-microsoft-com:vml" xmlns:wp="http://schemas.openxmlformats.org/drawingml/2006/wordprocessingDrawing" xmlns:w10="urn:schemas-microsoft-com:office:word" xmlns:w="http://schemas.openxmlformats.org/wordprocessingml/2006/main" xmlns:wne="http://schemas.microsoft.com/office/word/2006/wordml" xmlns:sl="http://schemas.openxmlformats.org/schemaLibrary/2006/main" xmlns:a="http://schemas.openxmlformats.org/drawingml/2006/main" xmlns:pic="http://schemas.openxmlformats.org/drawingml/2006/picture" xmlns:c="http://schemas.openxmlformats.org/drawingml/2006/chart" xmlns:lc="http://schemas.openxmlformats.org/drawingml/2006/lockedCanvas" xmlns:dgm="http://schemas.openxmlformats.org/drawingml/2006/diagram" xmlns:wps="http://schemas.microsoft.com/office/word/2010/wordprocessingShape" xmlns:wpg="http://schemas.microsoft.com/office/word/2010/wordprocessingGroup" xmlns:w14="http://schemas.microsoft.com/office/word/2010/wordml" xmlns:w15="http://schemas.microsoft.com/office/word/2012/wordml" xmlns:w16="http://schemas.microsoft.com/office/word/2018/wordml" xmlns:w16cex="http://schemas.microsoft.com/office/word/2018/wordml/cex" xmlns:w16cid="http://schemas.microsoft.com/office/word/2016/wordml/cid" xmlns="http://schemas.microsoft.com/office/tasks/2019/documenttasks" xmlns:cr="http://schemas.microsoft.com/office/comments/2020/reactions">
-  <w:p>
-    <w:pPr>
-      <w:widowControl w:val="0"/>
-      <w:pBdr>
-        <w:top w:space="0" w:sz="0" w:val="nil"/>
-        <w:left w:space="0" w:sz="0" w:val="nil"/>
-        <w:bottom w:space="0" w:sz="0" w:val="nil"/>
-        <w:right w:space="0" w:sz="0" w:val="nil"/>
-        <w:between w:space="0" w:sz="0" w:val="nil"/>
-      </w:pBdr>
-      <w:rPr>
-        <w:b w:val="1"/>
-        <w:bCs w:val="1"/>
-        <w:smallCaps w:val="1"/>
-        <w:color w:val="ffffff"/>
-        <w:sz w:val="16"/>
-        <w:szCs w:val="16"/>
-      </w:rPr>
-    </w:pPr>
-    <w:r>
-      <w:rPr>
-        <w:rtl w:val="0"/>
-      </w:rPr>
-    </w:r>
-  </w:p>
-  <w:tbl>
-    <w:tblPr>
-      <w:tblStyle w:val="Table10"/>
-      <w:tblW w:w="14567.0" w:type="dxa"/>
-      <w:jc w:val="center"/>
-      <w:tblBorders>
-        <w:bottom w:color="1f497d" w:space="0" w:sz="4" w:val="single"/>
-      </w:tblBorders>
-      <w:tblLayout w:type="fixed"/>
-      <w:tblLook w:val="0400"/>
-    </w:tblPr>
-    <w:tblGrid>
-      <w:gridCol w:w="12428"/>
-      <w:gridCol w:w="2139"/>
-      <w:tblGridChange w:id="0">
-        <w:tblGrid>
-          <w:gridCol w:w="12428"/>
-          <w:gridCol w:w="2139"/>
-        </w:tblGrid>
-      </w:tblGridChange>
-    </w:tblGrid>
-    <w:tr>
-      <w:trPr>
-        <w:cantSplit w:val="0"/>
-        <w:trHeight w:val="850" w:hRule="atLeast"/>
-        <w:tblHeader w:val="0"/>
-      </w:trPr>
-      <w:tc>
-        <w:tcPr>
-          <w:vAlign w:val="bottom"/>
-        </w:tcPr>
-        <w:p>
-          <w:pPr>
-            <w:pBdr>
-              <w:top w:space="0" w:sz="0" w:val="nil"/>
-              <w:left w:space="0" w:sz="0" w:val="nil"/>
-              <w:bottom w:space="0" w:sz="0" w:val="nil"/>
-              <w:right w:space="0" w:sz="0" w:val="nil"/>
-              <w:between w:space="0" w:sz="0" w:val="nil"/>
-            </w:pBdr>
-            <w:spacing w:after="200" w:lineRule="auto"/>
-            <w:rPr>
-              <w:b w:val="1"/>
-              <w:bCs w:val="1"/>
-              <w:smallCaps w:val="1"/>
-              <w:color w:val="1f497d"/>
-            </w:rPr>
-          </w:pPr>
-          <w:r>
-            <w:rPr>
-              <w:b w:val="1"/>
-              <w:bCs w:val="1"/>
-              <w:smallCaps w:val="1"/>
-              <w:color w:val="1f497d"/>
-              <w:rtl w:val="0"/>
-            </w:rPr>
-            <w:t xml:space="preserve">Curriculum VitaE  Mr. Dejan  Stojadinovic</w:t>
-          </w:r>
-        </w:p>
-      </w:tc>
-      <w:tc>
-        <w:tcPr>
-          <w:tcBorders>
-            <w:bottom w:color="1f497d" w:space="0" w:sz="4" w:val="single"/>
-            <w:right w:color="1f497d" w:space="0" w:sz="4" w:val="single"/>
-          </w:tcBorders>
-          <w:vAlign w:val="center"/>
-        </w:tcPr>
-        <w:p>
-          <w:pPr>
-            <w:pBdr>
-              <w:top w:space="0" w:sz="0" w:val="nil"/>
-              <w:left w:space="0" w:sz="0" w:val="nil"/>
-              <w:bottom w:space="0" w:sz="0" w:val="nil"/>
-              <w:right w:space="0" w:sz="0" w:val="nil"/>
-              <w:between w:space="0" w:sz="0" w:val="nil"/>
-            </w:pBdr>
-            <w:jc w:val="right"/>
-            <w:rPr>
-              <w:b w:val="1"/>
-              <w:bCs w:val="1"/>
-              <w:smallCaps w:val="1"/>
-              <w:color w:val="000000"/>
-              <w:sz w:val="16"/>
-              <w:szCs w:val="16"/>
-            </w:rPr>
-          </w:pPr>
-          <w:r>
-            <w:rPr>
-              <w:rtl w:val="0"/>
-            </w:rPr>
-          </w:r>
-          <w:r>
-            <w:drawing>
-              <wp:anchor allowOverlap="1" behindDoc="0" distB="0" distT="0" distL="114300" distR="114300" hidden="0" layoutInCell="1" locked="0" relativeHeight="0" simplePos="0">
-                <wp:simplePos x="0" y="0"/>
-                <wp:positionH relativeFrom="column">
-                  <wp:posOffset>480059</wp:posOffset>
-                </wp:positionH>
-                <wp:positionV relativeFrom="paragraph">
-                  <wp:posOffset>20320</wp:posOffset>
-                </wp:positionV>
-                <wp:extent cx="701040" cy="282575"/>
-                <wp:effectExtent b="0" l="0" r="0" t="0"/>
-                <wp:wrapNone/>
-                <wp:docPr id="1" name="image1.png"/>
-                <a:graphic>
-                  <a:graphicData uri="http://schemas.openxmlformats.org/drawingml/2006/picture">
-                    <pic:pic>
-                      <pic:nvPicPr>
-                        <pic:cNvPr id="0" name="image1.png"/>
-                        <pic:cNvPicPr preferRelativeResize="0"/>
-                      </pic:nvPicPr>
-                      <pic:blipFill>
-                        <a:blip r:embed="rId1"/>
-                        <a:srcRect b="-206" l="0" r="0" t="0"/>
-                        <a:stretch>
-                          <a:fillRect/>
-                        </a:stretch>
-                      </pic:blipFill>
-                      <pic:spPr>
-                        <a:xfrm>
-                          <a:off x="0" y="0"/>
-                          <a:ext cx="701040" cy="282575"/>
-                        </a:xfrm>
-                        <a:prstGeom prst="rect"/>
-                        <a:ln/>
-                      </pic:spPr>
-                    </pic:pic>
-                  </a:graphicData>
-                </a:graphic>
-              </wp:anchor>
-            </w:drawing>
-          </w:r>
-        </w:p>
-      </w:tc>
-    </w:tr>
-  </w:tbl>
-  <w:p>
-    <w:pPr>
-      <w:rPr/>
     </w:pPr>
     <w:r>
       <w:rPr>
@@ -3638,7 +3558,6 @@
         <w:b w:val="0"/>
         <w:bCs w:val="0"/>
       </w:rPr>
-      <w:tcPr/>
     </w:tblStylePr>
     <w:tblStylePr w:type="firstRow">
       <w:pPr>
@@ -3675,19 +3594,10 @@
         <w:shd w:fill="auto" w:val="clear"/>
       </w:tcPr>
     </w:tblStylePr>
-    <w:tblStylePr w:type="neCell">
-      <w:tcPr/>
-    </w:tblStylePr>
     <w:tblStylePr w:type="nwCell">
       <w:tcPr>
         <w:shd w:fill="1f497d" w:val="clear"/>
       </w:tcPr>
-    </w:tblStylePr>
-    <w:tblStylePr w:type="seCell">
-      <w:tcPr/>
-    </w:tblStylePr>
-    <w:tblStylePr w:type="swCell">
-      <w:tcPr/>
     </w:tblStylePr>
   </w:style>
   <w:style w:type="table" w:styleId="Table3">
@@ -3730,7 +3640,6 @@
         <w:b w:val="0"/>
         <w:bCs w:val="0"/>
       </w:rPr>
-      <w:tcPr/>
     </w:tblStylePr>
     <w:tblStylePr w:type="firstRow">
       <w:pPr>
@@ -3767,19 +3676,10 @@
         <w:shd w:fill="auto" w:val="clear"/>
       </w:tcPr>
     </w:tblStylePr>
-    <w:tblStylePr w:type="neCell">
-      <w:tcPr/>
-    </w:tblStylePr>
     <w:tblStylePr w:type="nwCell">
       <w:tcPr>
         <w:shd w:fill="1f497d" w:val="clear"/>
       </w:tcPr>
-    </w:tblStylePr>
-    <w:tblStylePr w:type="seCell">
-      <w:tcPr/>
-    </w:tblStylePr>
-    <w:tblStylePr w:type="swCell">
-      <w:tcPr/>
     </w:tblStylePr>
   </w:style>
   <w:style w:type="table" w:styleId="Table4">
@@ -3835,7 +3735,6 @@
         <w:b w:val="0"/>
         <w:bCs w:val="0"/>
       </w:rPr>
-      <w:tcPr/>
     </w:tblStylePr>
     <w:tblStylePr w:type="firstRow">
       <w:pPr>
@@ -3872,19 +3771,10 @@
         <w:shd w:fill="auto" w:val="clear"/>
       </w:tcPr>
     </w:tblStylePr>
-    <w:tblStylePr w:type="neCell">
-      <w:tcPr/>
-    </w:tblStylePr>
     <w:tblStylePr w:type="nwCell">
       <w:tcPr>
         <w:shd w:fill="1f497d" w:val="clear"/>
       </w:tcPr>
-    </w:tblStylePr>
-    <w:tblStylePr w:type="seCell">
-      <w:tcPr/>
-    </w:tblStylePr>
-    <w:tblStylePr w:type="swCell">
-      <w:tcPr/>
     </w:tblStylePr>
   </w:style>
   <w:style w:type="table" w:styleId="Table6">
@@ -3927,7 +3817,6 @@
         <w:b w:val="0"/>
         <w:bCs w:val="0"/>
       </w:rPr>
-      <w:tcPr/>
     </w:tblStylePr>
     <w:tblStylePr w:type="firstRow">
       <w:pPr>
@@ -3964,19 +3853,10 @@
         <w:shd w:fill="auto" w:val="clear"/>
       </w:tcPr>
     </w:tblStylePr>
-    <w:tblStylePr w:type="neCell">
-      <w:tcPr/>
-    </w:tblStylePr>
     <w:tblStylePr w:type="nwCell">
       <w:tcPr>
         <w:shd w:fill="1f497d" w:val="clear"/>
       </w:tcPr>
-    </w:tblStylePr>
-    <w:tblStylePr w:type="seCell">
-      <w:tcPr/>
-    </w:tblStylePr>
-    <w:tblStylePr w:type="swCell">
-      <w:tcPr/>
     </w:tblStylePr>
   </w:style>
   <w:style w:type="table" w:styleId="Table7">
@@ -4012,9 +3892,9 @@
       <w:tblStyleColBandSize w:val="1"/>
       <w:tblCellMar>
         <w:top w:w="0.0" w:type="dxa"/>
-        <w:left w:w="115.0" w:type="dxa"/>
+        <w:left w:w="0.0" w:type="dxa"/>
         <w:bottom w:w="0.0" w:type="dxa"/>
-        <w:right w:w="115.0" w:type="dxa"/>
+        <w:right w:w="0.0" w:type="dxa"/>
       </w:tblCellMar>
     </w:tblPr>
   </w:style>

</xml_diff>

<commit_message>
static template and current date fix
</commit_message>
<xml_diff>
--- a/templates/GIZ-Template.docx
+++ b/templates/GIZ-Template.docx
@@ -1242,7 +1242,7 @@
                 <w:color w:val="1f497d"/>
                 <w:rtl w:val="0"/>
               </w:rPr>
-              <w:t xml:space="preserve">Years within the firm (GFA):</w:t>
+              <w:t xml:space="preserve">Years within the firm:</w:t>
             </w:r>
             <w:r>
               <w:rPr>
@@ -2057,11 +2057,6 @@
         </w:rPr>
         <w:t xml:space="preserve">{% for pub in publications %} {{ pub }}</w:t>
       </w:r>
-      <w:r>
-        <w:rPr>
-          <w:rtl w:val="0"/>
-        </w:rPr>
-      </w:r>
     </w:p>
     <w:p>
       <w:pPr>
@@ -2086,11 +2081,6 @@
           <w:rtl w:val="0"/>
         </w:rPr>
         <w:t xml:space="preserve">{% endfor %}</w:t>
-      </w:r>
-      <w:r>
-        <w:rPr>
-          <w:rtl w:val="0"/>
-        </w:rPr>
       </w:r>
     </w:p>
     <w:sectPr>

</xml_diff>